<commit_message>
feat(fig1): rediseño workflow horizontal de 5 carriles + docs y preview
Reemplaza el borrador de Figura 1 por un esquema horizontal de carriles
(INPUT→SIGNATURE→REPURPOSING→PRIORITIZATION→VALIDATION), paleta Okabe-Ito
pastel colorblind-safe, tipografía y export alineados a _fig_style.R.
Números corregidos al manuscrito post-auditoría (embudo 3,352→666→458;
composite 0.60·TP+0.40·DV; CPTAC+TCGA), log2FC con subíndice real.

- scripts/fig1_workflow.R (nuevo) reemplaza fig1_workflow_draft.R (eliminado)
- figures.md: leyenda Fig1 actualizada (conteos del embudo, color-coded by stage)
- RUNBOOK/README/manuscript README: estado y comando de Fig1
- OUTPUTS.md regenerado; manuscript_PREVIEW.docx/.md reconstruidos con la figura nueva

Co-Authored-By: Claude Opus 4.8 <noreply@anthropic.com>
</commit_message>
<xml_diff>
--- a/docs/manuscript/manuscript_PREVIEW.docx
+++ b/docs/manuscript/manuscript_PREVIEW.docx
@@ -1826,7 +1826,7 @@
       <w:r>
         <w:drawing>
           <wp:inline>
-            <wp:extent cx="5334000" cy="5867400"/>
+            <wp:extent cx="5334000" cy="2581427"/>
             <wp:effectExtent b="0" l="0" r="0" t="0"/>
             <wp:docPr descr="" title="" id="28" name="Picture"/>
             <a:graphic>
@@ -1847,7 +1847,7 @@
                   <pic:spPr bwMode="auto">
                     <a:xfrm>
                       <a:off x="0" y="0"/>
-                      <a:ext cx="5334000" cy="5867400"/>
+                      <a:ext cx="5334000" cy="2581427"/>
                     </a:xfrm>
                     <a:prstGeom prst="rect">
                       <a:avLst/>
@@ -1879,58 +1879,55 @@
         <w:pStyle w:val="BodyText"/>
       </w:pPr>
       <w:r>
-        <w:t xml:space="preserve">Overview of the drug-repurposing pipeline for head and neck squamous cell carcinoma (HNSCC).</w:t>
-      </w:r>
-      <w:r>
-        <w:t xml:space="preserve"> </w:t>
-      </w:r>
-      <w:r>
-        <w:t xml:space="preserve">Ten paired tumor / adjacent-normal specimens were profiled by data-independent acquisition</w:t>
-      </w:r>
-      <w:r>
-        <w:t xml:space="preserve"> </w:t>
-      </w:r>
-      <w:r>
-        <w:t xml:space="preserve">(DIA) mass spectrometry (MaxQuant), yielding 3,352 quantified proteins. Differential abundance</w:t>
-      </w:r>
-      <w:r>
-        <w:t xml:space="preserve"> </w:t>
-      </w:r>
-      <w:r>
-        <w:t xml:space="preserve">(limma, paired contrast; |log₂FC| &gt; 1, FDR &lt; 0.05) defined the tumor proteomic signature, which</w:t>
-      </w:r>
-      <w:r>
-        <w:t xml:space="preserve"> </w:t>
-      </w:r>
-      <w:r>
-        <w:t xml:space="preserve">was mapped to candidate drugs across four resources (DGIdb, ChEMBL, Open Targets, L2S2). Targets</w:t>
-      </w:r>
-      <w:r>
-        <w:t xml:space="preserve"> </w:t>
-      </w:r>
-      <w:r>
-        <w:t xml:space="preserve">were placed in a tumor protein–protein interaction (PPI) network (STRING), partitioned into</w:t>
-      </w:r>
-      <w:r>
-        <w:t xml:space="preserve"> </w:t>
-      </w:r>
-      <w:r>
-        <w:t xml:space="preserve">Louvain modules, and each candidate was scored by a two-factor composite</w:t>
-      </w:r>
-      <w:r>
-        <w:t xml:space="preserve"> </w:t>
-      </w:r>
-      <w:r>
-        <w:t xml:space="preserve">(</w:t>
-      </w:r>
-      <w:r>
-        <w:rPr>
-          <w:rStyle w:val="VerbatimChar"/>
-        </w:rPr>
-        <w:t xml:space="preserve">0.60·TargetPriority + 0.40·DrugViability</w:t>
-      </w:r>
-      <w:r>
-        <w:t xml:space="preserve">) anchoring every drug to its most credible central</w:t>
+        <w:t xml:space="preserve">Overview of the drug-repurposing pipeline for head and neck squamous cell carcinoma (HNSCC),</w:t>
+      </w:r>
+      <w:r>
+        <w:t xml:space="preserve"> </w:t>
+      </w:r>
+      <w:r>
+        <w:t xml:space="preserve">color-coded by stage. Ten paired tumor / adjacent-normal specimens were profiled by</w:t>
+      </w:r>
+      <w:r>
+        <w:t xml:space="preserve"> </w:t>
+      </w:r>
+      <w:r>
+        <w:t xml:space="preserve">data-independent acquisition (DIA) mass spectrometry (MaxQuant), yielding 3,352 quantified</w:t>
+      </w:r>
+      <w:r>
+        <w:t xml:space="preserve"> </w:t>
+      </w:r>
+      <w:r>
+        <w:t xml:space="preserve">proteins. Differential abundance (limma, paired contrast; |log₂FC| &gt; 1, FDR &lt; 0.05) defined the</w:t>
+      </w:r>
+      <w:r>
+        <w:t xml:space="preserve"> </w:t>
+      </w:r>
+      <w:r>
+        <w:t xml:space="preserve">tumor proteomic signature (666 differentially abundant proteins; 329 increased, 337 decreased in</w:t>
+      </w:r>
+      <w:r>
+        <w:t xml:space="preserve"> </w:t>
+      </w:r>
+      <w:r>
+        <w:t xml:space="preserve">tumor), which was mapped to 458 multi-source candidate drugs across four resources (DGIdb, ChEMBL,</w:t>
+      </w:r>
+      <w:r>
+        <w:t xml:space="preserve"> </w:t>
+      </w:r>
+      <w:r>
+        <w:t xml:space="preserve">Open Targets, L2S2). Targets were placed in a tumor protein–protein interaction (PPI) network</w:t>
+      </w:r>
+      <w:r>
+        <w:t xml:space="preserve"> </w:t>
+      </w:r>
+      <w:r>
+        <w:t xml:space="preserve">(STRING), partitioned into Louvain modules, and each candidate was scored by a two-factor composite</w:t>
+      </w:r>
+      <w:r>
+        <w:t xml:space="preserve"> </w:t>
+      </w:r>
+      <w:r>
+        <w:t xml:space="preserve">(0.60·TargetPriority + 0.40·DrugViability) that anchors every drug to its most credible central</w:t>
       </w:r>
       <w:r>
         <w:t xml:space="preserve"> </w:t>
@@ -1942,13 +1939,13 @@
         <w:t xml:space="preserve"> </w:t>
       </w:r>
       <w:r>
-        <w:t xml:space="preserve">filter, and the directionality of prioritized targets was corroborated in two independent</w:t>
-      </w:r>
-      <w:r>
-        <w:t xml:space="preserve"> </w:t>
-      </w:r>
-      <w:r>
-        <w:t xml:space="preserve">cohorts (CPTAC-HNSCC proteome; TCGA-HNSC transcriptome).</w:t>
+        <w:t xml:space="preserve">filter, and the directionality of prioritized targets was corroborated in two independent cohorts</w:t>
+      </w:r>
+      <w:r>
+        <w:t xml:space="preserve"> </w:t>
+      </w:r>
+      <w:r>
+        <w:t xml:space="preserve">(CPTAC-HNSCC proteome; TCGA-HNSC transcriptome).</w:t>
       </w:r>
     </w:p>
     <w:p>

</xml_diff>

<commit_message>
docs(manuscript): actualiza references.bib y regenera ambos .docx; documenta el build
- references.bib: bear2025->qin2025, agrega papadaki2022 y shen2020, y alinea
  zang2012 al item de Zotero (Clin Cancer Res, PMID 22929803). Cobertura: las 39
  claves del manuscrito tienen entrada (0 faltantes)
- regenera manuscript_PREVIEW_pandoc_markers.docx (tokens [@key] para el escaneo
  Zotero) y manuscript_PREVIEW.docx (citeproc + bibliografía) desde el preview
  corregido; ambos sin bear2025
- REFERENCES_WORKFLOW.md: documenta la secuencia secciones .md -> _build_preview.py
  -> manuscript_PREVIEW.md -> pandoc con y sin markers

Co-Authored-By: Claude Opus 4.8 <noreply@anthropic.com>
</commit_message>
<xml_diff>
--- a/docs/manuscript/manuscript_PREVIEW.docx
+++ b/docs/manuscript/manuscript_PREVIEW.docx
@@ -45,19 +45,16 @@
         <w:t xml:space="preserve"> </w:t>
       </w:r>
       <w:r>
-        <w:t xml:space="preserve">recurrent disease.</w:t>
-      </w:r>
-      <w:r>
-        <w:t xml:space="preserve"> </w:t>
-      </w:r>
-      <w:r>
-        <w:t xml:space="preserve">(Johnson et al. 2020; Bray et al. 2024)</w:t>
-      </w:r>
-      <w:r>
-        <w:t xml:space="preserve"> </w:t>
-      </w:r>
-      <w:r>
-        <w:t xml:space="preserve">Despite advances across surgery,</w:t>
+        <w:t xml:space="preserve">recurrent disease</w:t>
+      </w:r>
+      <w:r>
+        <w:t xml:space="preserve"> </w:t>
+      </w:r>
+      <w:r>
+        <w:t xml:space="preserve">(Bray et al. 2024)</w:t>
+      </w:r>
+      <w:r>
+        <w:t xml:space="preserve">. Despite advances across surgery,</w:t>
       </w:r>
       <w:r>
         <w:t xml:space="preserve"> </w:t>
@@ -69,7 +66,7 @@
         <w:t xml:space="preserve"> </w:t>
       </w:r>
       <w:r>
-        <w:t xml:space="preserve">biologically complex the disease is.</w:t>
+        <w:t xml:space="preserve">biologically complex the disease is</w:t>
       </w:r>
       <w:r>
         <w:t xml:space="preserve"> </w:t>
@@ -77,6 +74,9 @@
       <w:r>
         <w:t xml:space="preserve">(Johnson et al. 2020)</w:t>
       </w:r>
+      <w:r>
+        <w:t xml:space="preserve">.</w:t>
+      </w:r>
     </w:p>
     <w:p>
       <w:pPr>
@@ -107,7 +107,7 @@
         <w:t xml:space="preserve"> </w:t>
       </w:r>
       <w:r>
-        <w:t xml:space="preserve">(CPS).</w:t>
+        <w:t xml:space="preserve">(CPS)</w:t>
       </w:r>
       <w:r>
         <w:t xml:space="preserve"> </w:t>
@@ -125,10 +125,7 @@
         <w:t xml:space="preserve">2019)</w:t>
       </w:r>
       <w:r>
-        <w:t xml:space="preserve"> </w:t>
-      </w:r>
-      <w:r>
-        <w:t xml:space="preserve">More recently, KEYNOTE-689 reported that perioperative</w:t>
+        <w:t xml:space="preserve">. More recently, KEYNOTE-689 reported that perioperative</w:t>
       </w:r>
       <w:r>
         <w:t xml:space="preserve"> </w:t>
@@ -140,7 +137,7 @@
         <w:t xml:space="preserve"> </w:t>
       </w:r>
       <w:r>
-        <w:t xml:space="preserve">locally advanced, resectable disease, a setting where progress had been comparatively slow.</w:t>
+        <w:t xml:space="preserve">locally advanced, resectable disease, a setting where progress had been comparatively slow</w:t>
       </w:r>
       <w:r>
         <w:t xml:space="preserve"> </w:t>
@@ -158,10 +155,7 @@
         <w:t xml:space="preserve">2025)</w:t>
       </w:r>
       <w:r>
-        <w:t xml:space="preserve"> </w:t>
-      </w:r>
-      <w:r>
-        <w:t xml:space="preserve">These advances highlight the need to find new molecular signatures</w:t>
+        <w:t xml:space="preserve">. These advances highlight the need to find new molecular signatures</w:t>
       </w:r>
       <w:r>
         <w:t xml:space="preserve"> </w:t>
@@ -193,7 +187,7 @@
         <w:t xml:space="preserve"> </w:t>
       </w:r>
       <w:r>
-        <w:t xml:space="preserve">insufficient to capture the functional complexity of the tumor.</w:t>
+        <w:t xml:space="preserve">insufficient to capture the functional complexity of the tumor</w:t>
       </w:r>
       <w:r>
         <w:t xml:space="preserve"> </w:t>
@@ -211,6 +205,9 @@
         <w:t xml:space="preserve">2010)</w:t>
       </w:r>
       <w:r>
+        <w:t xml:space="preserve">.</w:t>
+      </w:r>
+      <w:r>
         <w:t xml:space="preserve"> </w:t>
       </w:r>
       <w:r>
@@ -226,7 +223,7 @@
         <w:t xml:space="preserve"> </w:t>
       </w:r>
       <w:r>
-        <w:t xml:space="preserve">capturing both post-transcriptional and post-translational regulation.</w:t>
+        <w:t xml:space="preserve">capturing both post-transcriptional and post-translational regulation</w:t>
       </w:r>
       <w:r>
         <w:t xml:space="preserve"> </w:t>
@@ -235,6 +232,9 @@
         <w:t xml:space="preserve">(Aebersold and Mann 2016)</w:t>
       </w:r>
       <w:r>
+        <w:t xml:space="preserve">.</w:t>
+      </w:r>
+      <w:r>
         <w:t xml:space="preserve"> </w:t>
       </w:r>
       <w:r>
@@ -244,7 +244,7 @@
         <w:t xml:space="preserve"> </w:t>
       </w:r>
       <w:r>
-        <w:t xml:space="preserve">energy metabolism, and the tumor microenvironment in HNSCC.</w:t>
+        <w:t xml:space="preserve">energy metabolism, and the tumor microenvironment in HNSCC</w:t>
       </w:r>
       <w:r>
         <w:t xml:space="preserve"> </w:t>
@@ -261,6 +261,9 @@
       <w:r>
         <w:t xml:space="preserve">2021)</w:t>
       </w:r>
+      <w:r>
+        <w:t xml:space="preserve">.</w:t>
+      </w:r>
     </w:p>
     <w:p>
       <w:pPr>
@@ -285,7 +288,7 @@
         <w:t xml:space="preserve"> </w:t>
       </w:r>
       <w:r>
-        <w:t xml:space="preserve">state.</w:t>
+        <w:t xml:space="preserve">state</w:t>
       </w:r>
       <w:r>
         <w:t xml:space="preserve"> </w:t>
@@ -300,25 +303,10 @@
         <w:t xml:space="preserve"> </w:t>
       </w:r>
       <w:r>
-        <w:t xml:space="preserve">2019;</w:t>
-      </w:r>
-      <w:r>
-        <w:t xml:space="preserve"> </w:t>
-      </w:r>
-      <w:r>
-        <w:t xml:space="preserve">Tanoli et al.</w:t>
-      </w:r>
-      <w:r>
-        <w:t xml:space="preserve"> </w:t>
-      </w:r>
-      <w:r>
-        <w:t xml:space="preserve">2025)</w:t>
-      </w:r>
-      <w:r>
-        <w:t xml:space="preserve"> </w:t>
-      </w:r>
-      <w:r>
-        <w:t xml:space="preserve">Connectivity-based approaches typically prioritize</w:t>
+        <w:t xml:space="preserve">2019)</w:t>
+      </w:r>
+      <w:r>
+        <w:t xml:space="preserve">. Connectivity-based approaches typically prioritize</w:t>
       </w:r>
       <w:r>
         <w:t xml:space="preserve"> </w:t>
@@ -2002,7 +1990,55 @@
         <w:t xml:space="preserve"> </w:t>
       </w:r>
       <w:r>
-        <w:t xml:space="preserve">as a central hub within a broader signaling network. EGFR is frequently overexpressed in HNSCC, yet</w:t>
+        <w:t xml:space="preserve">as a central hub within a broader signaling network. Consistent with this, proteogenomic analysis of</w:t>
+      </w:r>
+      <w:r>
+        <w:t xml:space="preserve"> </w:t>
+      </w:r>
+      <w:r>
+        <w:t xml:space="preserve">the CPTAC HPV-negative cohort found that EGFR pathway activity is set by the abundance of EGFR</w:t>
+      </w:r>
+      <w:r>
+        <w:t xml:space="preserve"> </w:t>
+      </w:r>
+      <w:r>
+        <w:t xml:space="preserve">ligands, in particular AREG and TGFA, rather than by receptor amplification or overexpression, and</w:t>
+      </w:r>
+      <w:r>
+        <w:t xml:space="preserve"> </w:t>
+      </w:r>
+      <w:r>
+        <w:t xml:space="preserve">that ligand abundance, not receptor level, is the superior predictor of cetuximab response in</w:t>
+      </w:r>
+      <w:r>
+        <w:t xml:space="preserve"> </w:t>
+      </w:r>
+      <w:r>
+        <w:t xml:space="preserve">patient-derived xenografts and the proposed basis for selecting patients for anti-EGFR antibodies</w:t>
+      </w:r>
+      <w:r>
+        <w:t xml:space="preserve"> </w:t>
+      </w:r>
+      <w:r>
+        <w:t xml:space="preserve">(</w:t>
+      </w:r>
+      <w:r>
+        <w:t xml:space="preserve">Huang et al.</w:t>
+      </w:r>
+      <w:r>
+        <w:t xml:space="preserve"> </w:t>
+      </w:r>
+      <w:r>
+        <w:t xml:space="preserve">2021)</w:t>
+      </w:r>
+      <w:r>
+        <w:t xml:space="preserve">; the over-abundant receptor we prioritize is thus best read as one marker of a</w:t>
+      </w:r>
+      <w:r>
+        <w:t xml:space="preserve"> </w:t>
+      </w:r>
+      <w:r>
+        <w:t xml:space="preserve">ligand-driven hub rather than the rate-limiting factor itself. EGFR is frequently overexpressed in HNSCC, yet</w:t>
       </w:r>
       <w:r>
         <w:t xml:space="preserve"> </w:t>
@@ -2088,7 +2124,55 @@
         <w:t xml:space="preserve"> </w:t>
       </w:r>
       <w:r>
-        <w:t xml:space="preserve">epiphenomenon. This axis carries a plausible translational rationale: DNA methyltransferase</w:t>
+        <w:t xml:space="preserve">epiphenomenon. This places our prioritized epigenetic anchors (DNMT1, MAOA) within an externally</w:t>
+      </w:r>
+      <w:r>
+        <w:t xml:space="preserve"> </w:t>
+      </w:r>
+      <w:r>
+        <w:t xml:space="preserve">validated context: in the CPTAC HPV-negative cohort, the chromosomal-instability (CIN) molecular</w:t>
+      </w:r>
+      <w:r>
+        <w:t xml:space="preserve"> </w:t>
+      </w:r>
+      <w:r>
+        <w:t xml:space="preserve">subtype, the subgroup with the worst prognosis, showed elevated levels of multiple epigenetic</w:t>
+      </w:r>
+      <w:r>
+        <w:t xml:space="preserve"> </w:t>
+      </w:r>
+      <w:r>
+        <w:t xml:space="preserve">regulators at the protein but not the mRNA level</w:t>
+      </w:r>
+      <w:r>
+        <w:t xml:space="preserve"> </w:t>
+      </w:r>
+      <w:r>
+        <w:t xml:space="preserve">(</w:t>
+      </w:r>
+      <w:r>
+        <w:t xml:space="preserve">Huang et al.</w:t>
+      </w:r>
+      <w:r>
+        <w:t xml:space="preserve"> </w:t>
+      </w:r>
+      <w:r>
+        <w:t xml:space="preserve">2021)</w:t>
+      </w:r>
+      <w:r>
+        <w:t xml:space="preserve">; the concordance is notable because a protein-level signal of this kind would be</w:t>
+      </w:r>
+      <w:r>
+        <w:t xml:space="preserve"> </w:t>
+      </w:r>
+      <w:r>
+        <w:t xml:space="preserve">largely invisible to transcriptome-based analyses. This axis carries a plausible translational</w:t>
+      </w:r>
+      <w:r>
+        <w:t xml:space="preserve"> </w:t>
+      </w:r>
+      <w:r>
+        <w:t xml:space="preserve">rationale: DNA methyltransferase</w:t>
       </w:r>
       <w:r>
         <w:t xml:space="preserve"> </w:t>
@@ -2106,37 +2190,49 @@
         <w:t xml:space="preserve"> </w:t>
       </w:r>
       <w:r>
-        <w:t xml:space="preserve">(Bear et al. 2025)</w:t>
-      </w:r>
-      <w:r>
-        <w:t xml:space="preserve">. A recent phase 2 window trial reported that decitabine followed by pembrolizumab</w:t>
-      </w:r>
-      <w:r>
-        <w:t xml:space="preserve"> </w:t>
-      </w:r>
-      <w:r>
-        <w:t xml:space="preserve">increased tumor-infiltrating lymphocytes and PD-L1 expression and reduced myeloid-derived</w:t>
-      </w:r>
-      <w:r>
-        <w:t xml:space="preserve"> </w:t>
-      </w:r>
-      <w:r>
-        <w:t xml:space="preserve">suppressor cells before standard therapy</w:t>
-      </w:r>
-      <w:r>
-        <w:t xml:space="preserve"> </w:t>
-      </w:r>
-      <w:r>
-        <w:t xml:space="preserve">(Bear et al. 2025)</w:t>
-      </w:r>
-      <w:r>
-        <w:t xml:space="preserve">, illustrating the prime-then-checkpoint</w:t>
-      </w:r>
-      <w:r>
-        <w:t xml:space="preserve"> </w:t>
-      </w:r>
-      <w:r>
-        <w:t xml:space="preserve">strategy that our epigenetic nominations would support, an approach now being explored clinically.</w:t>
+        <w:t xml:space="preserve">(Qin et al. 2025)</w:t>
+      </w:r>
+      <w:r>
+        <w:t xml:space="preserve">. A recent phase 1b trial in immune-checkpoint-refractory HNSCC reported that, in a subset of patients, adding</w:t>
+      </w:r>
+      <w:r>
+        <w:t xml:space="preserve"> </w:t>
+      </w:r>
+      <w:r>
+        <w:t xml:space="preserve">low-dose 5-azacytidine to checkpoint blockade increased the intratumoral IFN-γ signature and PD-L1</w:t>
+      </w:r>
+      <w:r>
+        <w:t xml:space="preserve"> </w:t>
+      </w:r>
+      <w:r>
+        <w:t xml:space="preserve">expression, raised CD8+ T-cell infiltration while lowering regulatory T cells, and that these</w:t>
+      </w:r>
+      <w:r>
+        <w:t xml:space="preserve"> </w:t>
+      </w:r>
+      <w:r>
+        <w:t xml:space="preserve">changes correlated with prolonged survival on checkpoint rechallenge</w:t>
+      </w:r>
+      <w:r>
+        <w:t xml:space="preserve"> </w:t>
+      </w:r>
+      <w:r>
+        <w:t xml:space="preserve">(Qin et al. 2025)</w:t>
+      </w:r>
+      <w:r>
+        <w:t xml:space="preserve">, illustrating the</w:t>
+      </w:r>
+      <w:r>
+        <w:t xml:space="preserve"> </w:t>
+      </w:r>
+      <w:r>
+        <w:t xml:space="preserve">prime-then-checkpoint strategy that our epigenetic nominations would support, an approach now being</w:t>
+      </w:r>
+      <w:r>
+        <w:t xml:space="preserve"> </w:t>
+      </w:r>
+      <w:r>
+        <w:t xml:space="preserve">explored clinically in this disease.</w:t>
       </w:r>
       <w:r>
         <w:t xml:space="preserve"> </w:t>
@@ -2175,7 +2271,31 @@
         <w:t xml:space="preserve">(Zang et al. 2012)</w:t>
       </w:r>
       <w:r>
-        <w:t xml:space="preserve">. Proteostasis targeting is clinically established in hematologic malignancies but</w:t>
+        <w:t xml:space="preserve">. The hub is shared by several approved or investigational proteasome inhibitors;</w:t>
+      </w:r>
+      <w:r>
+        <w:t xml:space="preserve"> </w:t>
+      </w:r>
+      <w:r>
+        <w:t xml:space="preserve">bortezomib (as its D-mannitol formulation) and ixazomib rank highest by composite, whereas</w:t>
+      </w:r>
+      <w:r>
+        <w:t xml:space="preserve"> </w:t>
+      </w:r>
+      <w:r>
+        <w:t xml:space="preserve">carfilzomib, although marginally lower, is the agent we highlight for experimental follow-up because</w:t>
+      </w:r>
+      <w:r>
+        <w:t xml:space="preserve"> </w:t>
+      </w:r>
+      <w:r>
+        <w:t xml:space="preserve">it uniquely couples connectivity-based signature reversal with the HNSCC preclinical evidence cited</w:t>
+      </w:r>
+      <w:r>
+        <w:t xml:space="preserve"> </w:t>
+      </w:r>
+      <w:r>
+        <w:t xml:space="preserve">above. Proteostasis targeting is clinically established in hematologic malignancies but</w:t>
       </w:r>
       <w:r>
         <w:t xml:space="preserve"> </w:t>
@@ -2258,19 +2378,52 @@
         <w:t xml:space="preserve"> </w:t>
       </w:r>
       <w:r>
-        <w:t xml:space="preserve">rationale rather than on target overexpression: residual oxidative-phosphorylation dependence may</w:t>
-      </w:r>
-      <w:r>
-        <w:t xml:space="preserve"> </w:t>
-      </w:r>
-      <w:r>
-        <w:t xml:space="preserve">remain a targetable feature of cancer cells, and Complex I inhibition has been reported to exert</w:t>
-      </w:r>
-      <w:r>
-        <w:t xml:space="preserve"> </w:t>
-      </w:r>
-      <w:r>
-        <w:t xml:space="preserve">immunometabolic effects on the tumor microenvironment</w:t>
+        <w:t xml:space="preserve">rationale rather than on target overexpression. Although HNSCC is predominantly glycolytic at the</w:t>
+      </w:r>
+      <w:r>
+        <w:t xml:space="preserve"> </w:t>
+      </w:r>
+      <w:r>
+        <w:t xml:space="preserve">bulk level, tumor metabolism is plastic and heterogeneous: subpopulations, including certain</w:t>
+      </w:r>
+      <w:r>
+        <w:t xml:space="preserve"> </w:t>
+      </w:r>
+      <w:r>
+        <w:t xml:space="preserve">cancer-stem-cell states, can shift toward oxidative phosphorylation depending on microenvironmental</w:t>
+      </w:r>
+      <w:r>
+        <w:t xml:space="preserve"> </w:t>
+      </w:r>
+      <w:r>
+        <w:t xml:space="preserve">context, and this plasticity has been linked to therapy resistance</w:t>
+      </w:r>
+      <w:r>
+        <w:t xml:space="preserve"> </w:t>
+      </w:r>
+      <w:r>
+        <w:t xml:space="preserve">(Papadaki and Magklara 2022; Shen et al. 2020)</w:t>
+      </w:r>
+      <w:r>
+        <w:t xml:space="preserve">. A</w:t>
+      </w:r>
+      <w:r>
+        <w:t xml:space="preserve"> </w:t>
+      </w:r>
+      <w:r>
+        <w:t xml:space="preserve">residual or subpopulation-level dependence on oxidative phosphorylation could therefore remain a</w:t>
+      </w:r>
+      <w:r>
+        <w:t xml:space="preserve"> </w:t>
+      </w:r>
+      <w:r>
+        <w:t xml:space="preserve">targetable feature even in a globally glycolytic tumor, and Complex I inhibition has been reported</w:t>
+      </w:r>
+      <w:r>
+        <w:t xml:space="preserve"> </w:t>
+      </w:r>
+      <w:r>
+        <w:t xml:space="preserve">to exert immunometabolic effects on the tumor microenvironment</w:t>
       </w:r>
       <w:r>
         <w:t xml:space="preserve"> </w:t>
@@ -2300,13 +2453,40 @@
         <w:t xml:space="preserve">(Curry et al. 2018; Crist et al. 2022)</w:t>
       </w:r>
       <w:r>
-        <w:t xml:space="preserve">. Because single-agent metformin trials have been less effective than</w:t>
-      </w:r>
-      <w:r>
-        <w:t xml:space="preserve"> </w:t>
-      </w:r>
-      <w:r>
-        <w:t xml:space="preserve">observational data suggested</w:t>
+        <w:t xml:space="preserve">. Notably, this activity appears to depend on HPV status: metformin induced</w:t>
+      </w:r>
+      <w:r>
+        <w:t xml:space="preserve"> </w:t>
+      </w:r>
+      <w:r>
+        <w:t xml:space="preserve">significantly greater tumor-cell apoptosis in HPV-negative than in HPV-positive HNSCC, consistent</w:t>
+      </w:r>
+      <w:r>
+        <w:t xml:space="preserve"> </w:t>
+      </w:r>
+      <w:r>
+        <w:t xml:space="preserve">with the stronger glycolytic phenotype of HPV-negative disease</w:t>
+      </w:r>
+      <w:r>
+        <w:t xml:space="preserve"> </w:t>
+      </w:r>
+      <w:r>
+        <w:t xml:space="preserve">(Curry et al. 2018)</w:t>
+      </w:r>
+      <w:r>
+        <w:t xml:space="preserve">. A pharmacokinetic</w:t>
+      </w:r>
+      <w:r>
+        <w:t xml:space="preserve"> </w:t>
+      </w:r>
+      <w:r>
+        <w:t xml:space="preserve">consideration further shapes this interpretation: metformin inhibits Complex I only at millimolar</w:t>
+      </w:r>
+      <w:r>
+        <w:t xml:space="preserve"> </w:t>
+      </w:r>
+      <w:r>
+        <w:t xml:space="preserve">concentrations, well above the micromolar levels reached in patient plasma</w:t>
       </w:r>
       <w:r>
         <w:t xml:space="preserve"> </w:t>
@@ -2315,13 +2495,40 @@
         <w:t xml:space="preserve">(Pujalte-Martin et al. 2024)</w:t>
       </w:r>
       <w:r>
-        <w:t xml:space="preserve">, and early-phase HNSCC studies indicate</w:t>
-      </w:r>
-      <w:r>
-        <w:t xml:space="preserve"> </w:t>
-      </w:r>
-      <w:r>
-        <w:t xml:space="preserve">tolerability in combination with chemoradiation</w:t>
+        <w:t xml:space="preserve">, so</w:t>
+      </w:r>
+      <w:r>
+        <w:t xml:space="preserve"> </w:t>
+      </w:r>
+      <w:r>
+        <w:t xml:space="preserve">its clinical value may derive less from direct metabolic inhibition of tumor cells than from</w:t>
+      </w:r>
+      <w:r>
+        <w:t xml:space="preserve"> </w:t>
+      </w:r>
+      <w:r>
+        <w:t xml:space="preserve">reprogramming of the immune microenvironment. Consistent with this, single-agent metformin trials</w:t>
+      </w:r>
+      <w:r>
+        <w:t xml:space="preserve"> </w:t>
+      </w:r>
+      <w:r>
+        <w:t xml:space="preserve">have been less effective than observational data suggested</w:t>
+      </w:r>
+      <w:r>
+        <w:t xml:space="preserve"> </w:t>
+      </w:r>
+      <w:r>
+        <w:t xml:space="preserve">(Pujalte-Martin et al. 2024)</w:t>
+      </w:r>
+      <w:r>
+        <w:t xml:space="preserve">, and early-phase</w:t>
+      </w:r>
+      <w:r>
+        <w:t xml:space="preserve"> </w:t>
+      </w:r>
+      <w:r>
+        <w:t xml:space="preserve">HNSCC studies indicate tolerability in combination with chemoradiation</w:t>
       </w:r>
       <w:r>
         <w:t xml:space="preserve"> </w:t>
@@ -2330,19 +2537,19 @@
         <w:t xml:space="preserve">(Kemnade et al. 2023)</w:t>
       </w:r>
       <w:r>
-        <w:t xml:space="preserve">, we position metformin as a</w:t>
-      </w:r>
-      <w:r>
-        <w:t xml:space="preserve"> </w:t>
-      </w:r>
-      <w:r>
-        <w:t xml:space="preserve">combination candidate (with chemoradiation or immunotherapy) rather than as a single-agent</w:t>
-      </w:r>
-      <w:r>
-        <w:t xml:space="preserve"> </w:t>
-      </w:r>
-      <w:r>
-        <w:t xml:space="preserve">inhibitor of an over-expressed target.</w:t>
+        <w:t xml:space="preserve">; we therefore</w:t>
+      </w:r>
+      <w:r>
+        <w:t xml:space="preserve"> </w:t>
+      </w:r>
+      <w:r>
+        <w:t xml:space="preserve">position metformin as a combination candidate (with chemoradiation or immunotherapy) rather than as</w:t>
+      </w:r>
+      <w:r>
+        <w:t xml:space="preserve"> </w:t>
+      </w:r>
+      <w:r>
+        <w:t xml:space="preserve">a single-agent inhibitor of an over-expressed target.</w:t>
       </w:r>
     </w:p>
     <w:p>
@@ -2589,7 +2796,88 @@
         <w:t xml:space="preserve"> </w:t>
       </w:r>
       <w:r>
-        <w:t xml:space="preserve">cross-cohort corroboration mitigates but does not replace adequately powered confirmation. Tumor</w:t>
+        <w:t xml:space="preserve">cross-cohort corroboration mitigates but does not replace adequately powered confirmation. The</w:t>
+      </w:r>
+      <w:r>
+        <w:t xml:space="preserve"> </w:t>
+      </w:r>
+      <w:r>
+        <w:t xml:space="preserve">cohort is also mixed by HPV status (six HPV-positive, four HPV-negative) and the</w:t>
+      </w:r>
+      <w:r>
+        <w:t xml:space="preserve"> </w:t>
+      </w:r>
+      <w:r>
+        <w:t xml:space="preserve">differential-abundance analysis averaged over it, whereas one corroborating cohort (CPTAC) is</w:t>
+      </w:r>
+      <w:r>
+        <w:t xml:space="preserve"> </w:t>
+      </w:r>
+      <w:r>
+        <w:t xml:space="preserve">exclusively HPV-negative; because HPV-positive and HPV-negative HNSCC differ substantially in</w:t>
+      </w:r>
+      <w:r>
+        <w:t xml:space="preserve"> </w:t>
+      </w:r>
+      <w:r>
+        <w:t xml:space="preserve">metabolism and immune context</w:t>
+      </w:r>
+      <w:r>
+        <w:t xml:space="preserve"> </w:t>
+      </w:r>
+      <w:r>
+        <w:t xml:space="preserve">(Curry et al. 2018)</w:t>
+      </w:r>
+      <w:r>
+        <w:t xml:space="preserve">, some axis-level interpretations, in particular the</w:t>
+      </w:r>
+      <w:r>
+        <w:t xml:space="preserve"> </w:t>
+      </w:r>
+      <w:r>
+        <w:t xml:space="preserve">metabolic axis, may apply preferentially to the more glycolytic HPV-negative subgroup rather than</w:t>
+      </w:r>
+      <w:r>
+        <w:t xml:space="preserve"> </w:t>
+      </w:r>
+      <w:r>
+        <w:t xml:space="preserve">uniformly across HNSCC. If anything, this concentrates the relevance of the prioritized candidates</w:t>
+      </w:r>
+      <w:r>
+        <w:t xml:space="preserve"> </w:t>
+      </w:r>
+      <w:r>
+        <w:t xml:space="preserve">on HPV-negative disease, the subgroup that carries the worst prognosis and the greatest unmet</w:t>
+      </w:r>
+      <w:r>
+        <w:t xml:space="preserve"> </w:t>
+      </w:r>
+      <w:r>
+        <w:t xml:space="preserve">therapeutic need</w:t>
+      </w:r>
+      <w:r>
+        <w:t xml:space="preserve"> </w:t>
+      </w:r>
+      <w:r>
+        <w:t xml:space="preserve">(</w:t>
+      </w:r>
+      <w:r>
+        <w:t xml:space="preserve">Ang et al.</w:t>
+      </w:r>
+      <w:r>
+        <w:t xml:space="preserve"> </w:t>
+      </w:r>
+      <w:r>
+        <w:t xml:space="preserve">2010; Johnson et al. 2020)</w:t>
+      </w:r>
+      <w:r>
+        <w:t xml:space="preserve">, since the corroborating CPTAC proteome is itself</w:t>
+      </w:r>
+      <w:r>
+        <w:t xml:space="preserve"> </w:t>
+      </w:r>
+      <w:r>
+        <w:t xml:space="preserve">HPV-negative. Tumor</w:t>
       </w:r>
       <w:r>
         <w:t xml:space="preserve"> </w:t>
@@ -2705,7 +2993,7 @@
         <w:t xml:space="preserve"> </w:t>
       </w:r>
       <w:r>
-        <w:t xml:space="preserve">(Bear et al. 2025)</w:t>
+        <w:t xml:space="preserve">(Qin et al. 2025)</w:t>
       </w:r>
       <w:r>
         <w:t xml:space="preserve">. The proteasome axis warrants dose-response testing of carfilzomib in HNSCC cell lines</w:t>
@@ -6704,7 +6992,7 @@
       </w:r>
     </w:p>
     <w:bookmarkEnd w:id="47"/>
-    <w:bookmarkStart w:id="123" w:name="references"/>
+    <w:bookmarkStart w:id="127" w:name="references"/>
     <w:p>
       <w:pPr>
         <w:pStyle w:val="Heading1"/>
@@ -6713,7 +7001,7 @@
         <w:t xml:space="preserve">References</w:t>
       </w:r>
     </w:p>
-    <w:bookmarkStart w:id="122" w:name="refs"/>
+    <w:bookmarkStart w:id="126" w:name="refs"/>
     <w:bookmarkStart w:id="49" w:name="ref-aebersold2016"/>
     <w:p>
       <w:pPr>
@@ -6855,53 +7143,7 @@
       </w:r>
     </w:p>
     <w:bookmarkEnd w:id="53"/>
-    <w:bookmarkStart w:id="55" w:name="ref-bear2025"/>
-    <w:p>
-      <w:pPr>
-        <w:pStyle w:val="Bibliography"/>
-      </w:pPr>
-      <w:r>
-        <w:t xml:space="preserve">Bear, Harry D, Xiaoyan Deng, Dipankar Bandyopadhyay, et al. 2025.</w:t>
-      </w:r>
-      <w:r>
-        <w:t xml:space="preserve"> </w:t>
-      </w:r>
-      <w:r>
-        <w:t xml:space="preserve">“T-Cell Immune Checkpoint Inhibition Plus Hypomethylation for Locally Advanced HER2-Negative Breast Cancer: A Phase 2 Neoadjuvant Window Trial of Decitabine and Pembrolizumab Followed by Standard Neoadjuvant Chemotherapy.”</w:t>
-      </w:r>
-      <w:r>
-        <w:t xml:space="preserve"> </w:t>
-      </w:r>
-      <w:r>
-        <w:rPr>
-          <w:i/>
-          <w:iCs/>
-        </w:rPr>
-        <w:t xml:space="preserve">Journal for ImmunoTherapy of Cancer</w:t>
-      </w:r>
-      <w:r>
-        <w:t xml:space="preserve"> </w:t>
-      </w:r>
-      <w:r>
-        <w:t xml:space="preserve">13 (2): e010294.</w:t>
-      </w:r>
-      <w:r>
-        <w:t xml:space="preserve"> </w:t>
-      </w:r>
-      <w:hyperlink r:id="rId54">
-        <w:r>
-          <w:rPr>
-            <w:rStyle w:val="Hyperlink"/>
-          </w:rPr>
-          <w:t xml:space="preserve">https://doi.org/10.1136/jitc-2024-010294</w:t>
-        </w:r>
-      </w:hyperlink>
-      <w:r>
-        <w:t xml:space="preserve">.</w:t>
-      </w:r>
-    </w:p>
-    <w:bookmarkEnd w:id="55"/>
-    <w:bookmarkStart w:id="57" w:name="ref-bhatia2023"/>
+    <w:bookmarkStart w:id="55" w:name="ref-bhatia2023"/>
     <w:p>
       <w:pPr>
         <w:pStyle w:val="Bibliography"/>
@@ -6934,7 +7176,7 @@
       <w:r>
         <w:t xml:space="preserve"> </w:t>
       </w:r>
-      <w:hyperlink r:id="rId56">
+      <w:hyperlink r:id="rId54">
         <w:r>
           <w:rPr>
             <w:rStyle w:val="Hyperlink"/>
@@ -6946,8 +7188,8 @@
         <w:t xml:space="preserve">.</w:t>
       </w:r>
     </w:p>
-    <w:bookmarkEnd w:id="57"/>
-    <w:bookmarkStart w:id="59" w:name="ref-bray2024"/>
+    <w:bookmarkEnd w:id="55"/>
+    <w:bookmarkStart w:id="57" w:name="ref-bray2024"/>
     <w:p>
       <w:pPr>
         <w:pStyle w:val="Bibliography"/>
@@ -6980,7 +7222,7 @@
       <w:r>
         <w:t xml:space="preserve"> </w:t>
       </w:r>
-      <w:hyperlink r:id="rId58">
+      <w:hyperlink r:id="rId56">
         <w:r>
           <w:rPr>
             <w:rStyle w:val="Hyperlink"/>
@@ -6992,8 +7234,8 @@
         <w:t xml:space="preserve">.</w:t>
       </w:r>
     </w:p>
-    <w:bookmarkEnd w:id="59"/>
-    <w:bookmarkStart w:id="61" w:name="ref-burtness2019"/>
+    <w:bookmarkEnd w:id="57"/>
+    <w:bookmarkStart w:id="59" w:name="ref-burtness2019"/>
     <w:p>
       <w:pPr>
         <w:pStyle w:val="Bibliography"/>
@@ -7029,7 +7271,7 @@
       <w:r>
         <w:t xml:space="preserve"> </w:t>
       </w:r>
-      <w:hyperlink r:id="rId60">
+      <w:hyperlink r:id="rId58">
         <w:r>
           <w:rPr>
             <w:rStyle w:val="Hyperlink"/>
@@ -7041,8 +7283,8 @@
         <w:t xml:space="preserve">.</w:t>
       </w:r>
     </w:p>
-    <w:bookmarkEnd w:id="61"/>
-    <w:bookmarkStart w:id="63" w:name="ref-cannon2024"/>
+    <w:bookmarkEnd w:id="59"/>
+    <w:bookmarkStart w:id="61" w:name="ref-cannon2024"/>
     <w:p>
       <w:pPr>
         <w:pStyle w:val="Bibliography"/>
@@ -7075,7 +7317,7 @@
       <w:r>
         <w:t xml:space="preserve"> </w:t>
       </w:r>
-      <w:hyperlink r:id="rId62">
+      <w:hyperlink r:id="rId60">
         <w:r>
           <w:rPr>
             <w:rStyle w:val="Hyperlink"/>
@@ -7087,8 +7329,8 @@
         <w:t xml:space="preserve">.</w:t>
       </w:r>
     </w:p>
-    <w:bookmarkEnd w:id="63"/>
-    <w:bookmarkStart w:id="65" w:name="ref-carosi2026"/>
+    <w:bookmarkEnd w:id="61"/>
+    <w:bookmarkStart w:id="63" w:name="ref-carosi2026"/>
     <w:p>
       <w:pPr>
         <w:pStyle w:val="Bibliography"/>
@@ -7121,7 +7363,7 @@
       <w:r>
         <w:t xml:space="preserve"> </w:t>
       </w:r>
-      <w:hyperlink r:id="rId64">
+      <w:hyperlink r:id="rId62">
         <w:r>
           <w:rPr>
             <w:rStyle w:val="Hyperlink"/>
@@ -7133,8 +7375,8 @@
         <w:t xml:space="preserve">.</w:t>
       </w:r>
     </w:p>
-    <w:bookmarkEnd w:id="65"/>
-    <w:bookmarkStart w:id="67" w:name="ref-cheng2019"/>
+    <w:bookmarkEnd w:id="63"/>
+    <w:bookmarkStart w:id="65" w:name="ref-cheng2019"/>
     <w:p>
       <w:pPr>
         <w:pStyle w:val="Bibliography"/>
@@ -7167,7 +7409,7 @@
       <w:r>
         <w:t xml:space="preserve"> </w:t>
       </w:r>
-      <w:hyperlink r:id="rId66">
+      <w:hyperlink r:id="rId64">
         <w:r>
           <w:rPr>
             <w:rStyle w:val="Hyperlink"/>
@@ -7179,8 +7421,8 @@
         <w:t xml:space="preserve">.</w:t>
       </w:r>
     </w:p>
-    <w:bookmarkEnd w:id="67"/>
-    <w:bookmarkStart w:id="69" w:name="ref-crist2022"/>
+    <w:bookmarkEnd w:id="65"/>
+    <w:bookmarkStart w:id="67" w:name="ref-crist2022"/>
     <w:p>
       <w:pPr>
         <w:pStyle w:val="Bibliography"/>
@@ -7213,7 +7455,7 @@
       <w:r>
         <w:t xml:space="preserve"> </w:t>
       </w:r>
-      <w:hyperlink r:id="rId68">
+      <w:hyperlink r:id="rId66">
         <w:r>
           <w:rPr>
             <w:rStyle w:val="Hyperlink"/>
@@ -7225,8 +7467,8 @@
         <w:t xml:space="preserve">.</w:t>
       </w:r>
     </w:p>
-    <w:bookmarkEnd w:id="69"/>
-    <w:bookmarkStart w:id="71" w:name="ref-curry2018"/>
+    <w:bookmarkEnd w:id="67"/>
+    <w:bookmarkStart w:id="69" w:name="ref-curry2018"/>
     <w:p>
       <w:pPr>
         <w:pStyle w:val="Bibliography"/>
@@ -7259,7 +7501,7 @@
       <w:r>
         <w:t xml:space="preserve"> </w:t>
       </w:r>
-      <w:hyperlink r:id="rId70">
+      <w:hyperlink r:id="rId68">
         <w:r>
           <w:rPr>
             <w:rStyle w:val="Hyperlink"/>
@@ -7271,8 +7513,8 @@
         <w:t xml:space="preserve">.</w:t>
       </w:r>
     </w:p>
-    <w:bookmarkEnd w:id="71"/>
-    <w:bookmarkStart w:id="73" w:name="ref-flanary2023"/>
+    <w:bookmarkEnd w:id="69"/>
+    <w:bookmarkStart w:id="71" w:name="ref-flanary2023"/>
     <w:p>
       <w:pPr>
         <w:pStyle w:val="Bibliography"/>
@@ -7305,7 +7547,7 @@
       <w:r>
         <w:t xml:space="preserve"> </w:t>
       </w:r>
-      <w:hyperlink r:id="rId72">
+      <w:hyperlink r:id="rId70">
         <w:r>
           <w:rPr>
             <w:rStyle w:val="Hyperlink"/>
@@ -7317,8 +7559,8 @@
         <w:t xml:space="preserve">.</w:t>
       </w:r>
     </w:p>
-    <w:bookmarkEnd w:id="73"/>
-    <w:bookmarkStart w:id="75" w:name="ref-gu2022"/>
+    <w:bookmarkEnd w:id="71"/>
+    <w:bookmarkStart w:id="73" w:name="ref-gu2022"/>
     <w:p>
       <w:pPr>
         <w:pStyle w:val="Bibliography"/>
@@ -7351,7 +7593,7 @@
       <w:r>
         <w:t xml:space="preserve"> </w:t>
       </w:r>
-      <w:hyperlink r:id="rId74">
+      <w:hyperlink r:id="rId72">
         <w:r>
           <w:rPr>
             <w:rStyle w:val="Hyperlink"/>
@@ -7363,8 +7605,8 @@
         <w:t xml:space="preserve">.</w:t>
       </w:r>
     </w:p>
-    <w:bookmarkEnd w:id="75"/>
-    <w:bookmarkStart w:id="77" w:name="ref-huang2021"/>
+    <w:bookmarkEnd w:id="73"/>
+    <w:bookmarkStart w:id="75" w:name="ref-huang2021"/>
     <w:p>
       <w:pPr>
         <w:pStyle w:val="Bibliography"/>
@@ -7400,7 +7642,7 @@
       <w:r>
         <w:t xml:space="preserve"> </w:t>
       </w:r>
-      <w:hyperlink r:id="rId76">
+      <w:hyperlink r:id="rId74">
         <w:r>
           <w:rPr>
             <w:rStyle w:val="Hyperlink"/>
@@ -7412,8 +7654,8 @@
         <w:t xml:space="preserve">.</w:t>
       </w:r>
     </w:p>
-    <w:bookmarkEnd w:id="77"/>
-    <w:bookmarkStart w:id="79" w:name="ref-johnson2020"/>
+    <w:bookmarkEnd w:id="75"/>
+    <w:bookmarkStart w:id="77" w:name="ref-johnson2020"/>
     <w:p>
       <w:pPr>
         <w:pStyle w:val="Bibliography"/>
@@ -7446,7 +7688,7 @@
       <w:r>
         <w:t xml:space="preserve"> </w:t>
       </w:r>
-      <w:hyperlink r:id="rId78">
+      <w:hyperlink r:id="rId76">
         <w:r>
           <w:rPr>
             <w:rStyle w:val="Hyperlink"/>
@@ -7458,8 +7700,8 @@
         <w:t xml:space="preserve">.</w:t>
       </w:r>
     </w:p>
-    <w:bookmarkEnd w:id="79"/>
-    <w:bookmarkStart w:id="81" w:name="ref-kemnade2023"/>
+    <w:bookmarkEnd w:id="77"/>
+    <w:bookmarkStart w:id="79" w:name="ref-kemnade2023"/>
     <w:p>
       <w:pPr>
         <w:pStyle w:val="Bibliography"/>
@@ -7492,7 +7734,7 @@
       <w:r>
         <w:t xml:space="preserve"> </w:t>
       </w:r>
-      <w:hyperlink r:id="rId80">
+      <w:hyperlink r:id="rId78">
         <w:r>
           <w:rPr>
             <w:rStyle w:val="Hyperlink"/>
@@ -7504,8 +7746,8 @@
         <w:t xml:space="preserve">.</w:t>
       </w:r>
     </w:p>
-    <w:bookmarkEnd w:id="81"/>
-    <w:bookmarkStart w:id="83" w:name="ref-kumar2025"/>
+    <w:bookmarkEnd w:id="79"/>
+    <w:bookmarkStart w:id="81" w:name="ref-kumar2025"/>
     <w:p>
       <w:pPr>
         <w:pStyle w:val="Bibliography"/>
@@ -7538,7 +7780,7 @@
       <w:r>
         <w:t xml:space="preserve"> </w:t>
       </w:r>
-      <w:hyperlink r:id="rId82">
+      <w:hyperlink r:id="rId80">
         <w:r>
           <w:rPr>
             <w:rStyle w:val="Hyperlink"/>
@@ -7550,8 +7792,8 @@
         <w:t xml:space="preserve">.</w:t>
       </w:r>
     </w:p>
-    <w:bookmarkEnd w:id="83"/>
-    <w:bookmarkStart w:id="85" w:name="ref-lamb2006"/>
+    <w:bookmarkEnd w:id="81"/>
+    <w:bookmarkStart w:id="83" w:name="ref-lamb2006"/>
     <w:p>
       <w:pPr>
         <w:pStyle w:val="Bibliography"/>
@@ -7587,7 +7829,7 @@
       <w:r>
         <w:t xml:space="preserve"> </w:t>
       </w:r>
-      <w:hyperlink r:id="rId84">
+      <w:hyperlink r:id="rId82">
         <w:r>
           <w:rPr>
             <w:rStyle w:val="Hyperlink"/>
@@ -7599,8 +7841,8 @@
         <w:t xml:space="preserve">.</w:t>
       </w:r>
     </w:p>
-    <w:bookmarkEnd w:id="85"/>
-    <w:bookmarkStart w:id="87" w:name="ref-li2024"/>
+    <w:bookmarkEnd w:id="83"/>
+    <w:bookmarkStart w:id="85" w:name="ref-li2024"/>
     <w:p>
       <w:pPr>
         <w:pStyle w:val="Bibliography"/>
@@ -7633,7 +7875,7 @@
       <w:r>
         <w:t xml:space="preserve"> </w:t>
       </w:r>
-      <w:hyperlink r:id="rId86">
+      <w:hyperlink r:id="rId84">
         <w:r>
           <w:rPr>
             <w:rStyle w:val="Hyperlink"/>
@@ -7645,8 +7887,8 @@
         <w:t xml:space="preserve">.</w:t>
       </w:r>
     </w:p>
-    <w:bookmarkEnd w:id="87"/>
-    <w:bookmarkStart w:id="89" w:name="ref-liberzon2015"/>
+    <w:bookmarkEnd w:id="85"/>
+    <w:bookmarkStart w:id="87" w:name="ref-liberzon2015"/>
     <w:p>
       <w:pPr>
         <w:pStyle w:val="Bibliography"/>
@@ -7679,7 +7921,7 @@
       <w:r>
         <w:t xml:space="preserve"> </w:t>
       </w:r>
-      <w:hyperlink r:id="rId88">
+      <w:hyperlink r:id="rId86">
         <w:r>
           <w:rPr>
             <w:rStyle w:val="Hyperlink"/>
@@ -7691,8 +7933,8 @@
         <w:t xml:space="preserve">.</w:t>
       </w:r>
     </w:p>
-    <w:bookmarkEnd w:id="89"/>
-    <w:bookmarkStart w:id="91" w:name="ref-evangelista2025"/>
+    <w:bookmarkEnd w:id="87"/>
+    <w:bookmarkStart w:id="89" w:name="ref-evangelista2025"/>
     <w:p>
       <w:pPr>
         <w:pStyle w:val="Bibliography"/>
@@ -7725,7 +7967,7 @@
       <w:r>
         <w:t xml:space="preserve"> </w:t>
       </w:r>
-      <w:hyperlink r:id="rId90">
+      <w:hyperlink r:id="rId88">
         <w:r>
           <w:rPr>
             <w:rStyle w:val="Hyperlink"/>
@@ -7737,8 +7979,8 @@
         <w:t xml:space="preserve">.</w:t>
       </w:r>
     </w:p>
-    <w:bookmarkEnd w:id="91"/>
-    <w:bookmarkStart w:id="93" w:name="ref-mendez2019"/>
+    <w:bookmarkEnd w:id="89"/>
+    <w:bookmarkStart w:id="91" w:name="ref-mendez2019"/>
     <w:p>
       <w:pPr>
         <w:pStyle w:val="Bibliography"/>
@@ -7774,7 +8016,7 @@
       <w:r>
         <w:t xml:space="preserve"> </w:t>
       </w:r>
-      <w:hyperlink r:id="rId92">
+      <w:hyperlink r:id="rId90">
         <w:r>
           <w:rPr>
             <w:rStyle w:val="Hyperlink"/>
@@ -7786,8 +8028,8 @@
         <w:t xml:space="preserve">.</w:t>
       </w:r>
     </w:p>
-    <w:bookmarkEnd w:id="93"/>
-    <w:bookmarkStart w:id="95" w:name="ref-noronha2023"/>
+    <w:bookmarkEnd w:id="91"/>
+    <w:bookmarkStart w:id="93" w:name="ref-noronha2023"/>
     <w:p>
       <w:pPr>
         <w:pStyle w:val="Bibliography"/>
@@ -7820,7 +8062,7 @@
       <w:r>
         <w:t xml:space="preserve"> </w:t>
       </w:r>
-      <w:hyperlink r:id="rId94">
+      <w:hyperlink r:id="rId92">
         <w:r>
           <w:rPr>
             <w:rStyle w:val="Hyperlink"/>
@@ -7832,8 +8074,8 @@
         <w:t xml:space="preserve">.</w:t>
       </w:r>
     </w:p>
-    <w:bookmarkEnd w:id="95"/>
-    <w:bookmarkStart w:id="97" w:name="ref-oneill2022"/>
+    <w:bookmarkEnd w:id="93"/>
+    <w:bookmarkStart w:id="95" w:name="ref-oneill2022"/>
     <w:p>
       <w:pPr>
         <w:pStyle w:val="Bibliography"/>
@@ -7866,7 +8108,7 @@
       <w:r>
         <w:t xml:space="preserve"> </w:t>
       </w:r>
-      <w:hyperlink r:id="rId96">
+      <w:hyperlink r:id="rId94">
         <w:r>
           <w:rPr>
             <w:rStyle w:val="Hyperlink"/>
@@ -7878,8 +8120,8 @@
         <w:t xml:space="preserve">.</w:t>
       </w:r>
     </w:p>
-    <w:bookmarkEnd w:id="97"/>
-    <w:bookmarkStart w:id="99" w:name="ref-ochoa2021"/>
+    <w:bookmarkEnd w:id="95"/>
+    <w:bookmarkStart w:id="97" w:name="ref-ochoa2021"/>
     <w:p>
       <w:pPr>
         <w:pStyle w:val="Bibliography"/>
@@ -7915,12 +8157,58 @@
       <w:r>
         <w:t xml:space="preserve"> </w:t>
       </w:r>
+      <w:hyperlink r:id="rId96">
+        <w:r>
+          <w:rPr>
+            <w:rStyle w:val="Hyperlink"/>
+          </w:rPr>
+          <w:t xml:space="preserve">https://doi.org/10.1093/nar/gkaa1027</w:t>
+        </w:r>
+      </w:hyperlink>
+      <w:r>
+        <w:t xml:space="preserve">.</w:t>
+      </w:r>
+    </w:p>
+    <w:bookmarkEnd w:id="97"/>
+    <w:bookmarkStart w:id="99" w:name="ref-papadaki2022"/>
+    <w:p>
+      <w:pPr>
+        <w:pStyle w:val="Bibliography"/>
+      </w:pPr>
+      <w:r>
+        <w:t xml:space="preserve">Papadaki, Styliani, and Angeliki Magklara. 2022.</w:t>
+      </w:r>
+      <w:r>
+        <w:t xml:space="preserve"> </w:t>
+      </w:r>
+      <w:r>
+        <w:t xml:space="preserve">“Regulation of Metabolic Plasticity in Cancer Stem Cells and Implications in Cancer Therapy.”</w:t>
+      </w:r>
+      <w:r>
+        <w:t xml:space="preserve"> </w:t>
+      </w:r>
+      <w:r>
+        <w:rPr>
+          <w:i/>
+          <w:iCs/>
+        </w:rPr>
+        <w:t xml:space="preserve">Cancers</w:t>
+      </w:r>
+      <w:r>
+        <w:t xml:space="preserve"> </w:t>
+      </w:r>
+      <w:r>
+        <w:t xml:space="preserve">14 (23): 5912.</w:t>
+      </w:r>
+      <w:r>
+        <w:t xml:space="preserve"> </w:t>
+      </w:r>
       <w:hyperlink r:id="rId98">
         <w:r>
           <w:rPr>
             <w:rStyle w:val="Hyperlink"/>
           </w:rPr>
-          <w:t xml:space="preserve">https://doi.org/10.1093/nar/gkaa1027</w:t>
+          <w:t xml:space="preserve">https://doi.org/10.3390/cancers14235912</w:t>
         </w:r>
       </w:hyperlink>
       <w:r>
@@ -8023,7 +8311,53 @@
       </w:r>
     </w:p>
     <w:bookmarkEnd w:id="103"/>
-    <w:bookmarkStart w:id="105" w:name="ref-ritchie2015"/>
+    <w:bookmarkStart w:id="105" w:name="ref-qin2025"/>
+    <w:p>
+      <w:pPr>
+        <w:pStyle w:val="Bibliography"/>
+      </w:pPr>
+      <w:r>
+        <w:t xml:space="preserve">Qin, Tingting, Austin K Mattox, Jean S Campbell, et al. 2025.</w:t>
+      </w:r>
+      <w:r>
+        <w:t xml:space="preserve"> </w:t>
+      </w:r>
+      <w:r>
+        <w:t xml:space="preserve">“Epigenetic Therapy Sensitizes Anti-PD-1 Refractory Head and Neck Cancers to Immunotherapy Rechallenge.”</w:t>
+      </w:r>
+      <w:r>
+        <w:t xml:space="preserve"> </w:t>
+      </w:r>
+      <w:r>
+        <w:rPr>
+          <w:i/>
+          <w:iCs/>
+        </w:rPr>
+        <w:t xml:space="preserve">The Journal of Clinical Investigation</w:t>
+      </w:r>
+      <w:r>
+        <w:t xml:space="preserve"> </w:t>
+      </w:r>
+      <w:r>
+        <w:t xml:space="preserve">135 (6).</w:t>
+      </w:r>
+      <w:r>
+        <w:t xml:space="preserve"> </w:t>
+      </w:r>
+      <w:hyperlink r:id="rId104">
+        <w:r>
+          <w:rPr>
+            <w:rStyle w:val="Hyperlink"/>
+          </w:rPr>
+          <w:t xml:space="preserve">https://doi.org/10.1172/JCI181671</w:t>
+        </w:r>
+      </w:hyperlink>
+      <w:r>
+        <w:t xml:space="preserve">.</w:t>
+      </w:r>
+    </w:p>
+    <w:bookmarkEnd w:id="105"/>
+    <w:bookmarkStart w:id="107" w:name="ref-ritchie2015"/>
     <w:p>
       <w:pPr>
         <w:pStyle w:val="Bibliography"/>
@@ -8056,7 +8390,7 @@
       <w:r>
         <w:t xml:space="preserve"> </w:t>
       </w:r>
-      <w:hyperlink r:id="rId104">
+      <w:hyperlink r:id="rId106">
         <w:r>
           <w:rPr>
             <w:rStyle w:val="Hyperlink"/>
@@ -8068,8 +8402,54 @@
         <w:t xml:space="preserve">.</w:t>
       </w:r>
     </w:p>
-    <w:bookmarkEnd w:id="105"/>
-    <w:bookmarkStart w:id="107" w:name="ref-subramanian2017"/>
+    <w:bookmarkEnd w:id="107"/>
+    <w:bookmarkStart w:id="109" w:name="ref-shen2020"/>
+    <w:p>
+      <w:pPr>
+        <w:pStyle w:val="Bibliography"/>
+      </w:pPr>
+      <w:r>
+        <w:t xml:space="preserve">Shen, Yao-An, Siao-Cian Pan, I Chu, Ruo-Yun Lai, and Yau-Huei Wei. 2020.</w:t>
+      </w:r>
+      <w:r>
+        <w:t xml:space="preserve"> </w:t>
+      </w:r>
+      <w:r>
+        <w:t xml:space="preserve">“Targeting Cancer Stem Cells from a Metabolic Perspective.”</w:t>
+      </w:r>
+      <w:r>
+        <w:t xml:space="preserve"> </w:t>
+      </w:r>
+      <w:r>
+        <w:rPr>
+          <w:i/>
+          <w:iCs/>
+        </w:rPr>
+        <w:t xml:space="preserve">Experimental Biology and Medicine</w:t>
+      </w:r>
+      <w:r>
+        <w:t xml:space="preserve"> </w:t>
+      </w:r>
+      <w:r>
+        <w:t xml:space="preserve">245 (5): 465–76.</w:t>
+      </w:r>
+      <w:r>
+        <w:t xml:space="preserve"> </w:t>
+      </w:r>
+      <w:hyperlink r:id="rId108">
+        <w:r>
+          <w:rPr>
+            <w:rStyle w:val="Hyperlink"/>
+          </w:rPr>
+          <w:t xml:space="preserve">https://doi.org/10.1177/1535370220909309</w:t>
+        </w:r>
+      </w:hyperlink>
+      <w:r>
+        <w:t xml:space="preserve">.</w:t>
+      </w:r>
+    </w:p>
+    <w:bookmarkEnd w:id="109"/>
+    <w:bookmarkStart w:id="111" w:name="ref-subramanian2017"/>
     <w:p>
       <w:pPr>
         <w:pStyle w:val="Bibliography"/>
@@ -8105,7 +8485,7 @@
       <w:r>
         <w:t xml:space="preserve"> </w:t>
       </w:r>
-      <w:hyperlink r:id="rId106">
+      <w:hyperlink r:id="rId110">
         <w:r>
           <w:rPr>
             <w:rStyle w:val="Hyperlink"/>
@@ -8117,8 +8497,8 @@
         <w:t xml:space="preserve">.</w:t>
       </w:r>
     </w:p>
-    <w:bookmarkEnd w:id="107"/>
-    <w:bookmarkStart w:id="109" w:name="ref-subramanian2005"/>
+    <w:bookmarkEnd w:id="111"/>
+    <w:bookmarkStart w:id="113" w:name="ref-subramanian2005"/>
     <w:p>
       <w:pPr>
         <w:pStyle w:val="Bibliography"/>
@@ -8154,7 +8534,7 @@
       <w:r>
         <w:t xml:space="preserve"> </w:t>
       </w:r>
-      <w:hyperlink r:id="rId108">
+      <w:hyperlink r:id="rId112">
         <w:r>
           <w:rPr>
             <w:rStyle w:val="Hyperlink"/>
@@ -8166,8 +8546,8 @@
         <w:t xml:space="preserve">.</w:t>
       </w:r>
     </w:p>
-    <w:bookmarkEnd w:id="109"/>
-    <w:bookmarkStart w:id="111" w:name="ref-szklarczyk2023"/>
+    <w:bookmarkEnd w:id="113"/>
+    <w:bookmarkStart w:id="115" w:name="ref-szklarczyk2023"/>
     <w:p>
       <w:pPr>
         <w:pStyle w:val="Bibliography"/>
@@ -8203,7 +8583,7 @@
       <w:r>
         <w:t xml:space="preserve"> </w:t>
       </w:r>
-      <w:hyperlink r:id="rId110">
+      <w:hyperlink r:id="rId114">
         <w:r>
           <w:rPr>
             <w:rStyle w:val="Hyperlink"/>
@@ -8215,8 +8595,8 @@
         <w:t xml:space="preserve">.</w:t>
       </w:r>
     </w:p>
-    <w:bookmarkEnd w:id="111"/>
-    <w:bookmarkStart w:id="113" w:name="ref-tanoli2025"/>
+    <w:bookmarkEnd w:id="115"/>
+    <w:bookmarkStart w:id="117" w:name="ref-tanoli2025"/>
     <w:p>
       <w:pPr>
         <w:pStyle w:val="Bibliography"/>
@@ -8252,7 +8632,7 @@
       <w:r>
         <w:t xml:space="preserve"> </w:t>
       </w:r>
-      <w:hyperlink r:id="rId112">
+      <w:hyperlink r:id="rId116">
         <w:r>
           <w:rPr>
             <w:rStyle w:val="Hyperlink"/>
@@ -8264,8 +8644,8 @@
         <w:t xml:space="preserve">.</w:t>
       </w:r>
     </w:p>
-    <w:bookmarkEnd w:id="113"/>
-    <w:bookmarkStart w:id="115" w:name="ref-uppaluri2025"/>
+    <w:bookmarkEnd w:id="117"/>
+    <w:bookmarkStart w:id="119" w:name="ref-uppaluri2025"/>
     <w:p>
       <w:pPr>
         <w:pStyle w:val="Bibliography"/>
@@ -8301,7 +8681,7 @@
       <w:r>
         <w:t xml:space="preserve"> </w:t>
       </w:r>
-      <w:hyperlink r:id="rId114">
+      <w:hyperlink r:id="rId118">
         <w:r>
           <w:rPr>
             <w:rStyle w:val="Hyperlink"/>
@@ -8313,8 +8693,8 @@
         <w:t xml:space="preserve">.</w:t>
       </w:r>
     </w:p>
-    <w:bookmarkEnd w:id="115"/>
-    <w:bookmarkStart w:id="117" w:name="ref-wu2025"/>
+    <w:bookmarkEnd w:id="119"/>
+    <w:bookmarkStart w:id="121" w:name="ref-wu2025"/>
     <w:p>
       <w:pPr>
         <w:pStyle w:val="Bibliography"/>
@@ -8347,7 +8727,7 @@
       <w:r>
         <w:t xml:space="preserve"> </w:t>
       </w:r>
-      <w:hyperlink r:id="rId116">
+      <w:hyperlink r:id="rId120">
         <w:r>
           <w:rPr>
             <w:rStyle w:val="Hyperlink"/>
@@ -8359,8 +8739,8 @@
         <w:t xml:space="preserve">.</w:t>
       </w:r>
     </w:p>
-    <w:bookmarkEnd w:id="117"/>
-    <w:bookmarkStart w:id="119" w:name="ref-wu2021"/>
+    <w:bookmarkEnd w:id="121"/>
+    <w:bookmarkStart w:id="123" w:name="ref-wu2021"/>
     <w:p>
       <w:pPr>
         <w:pStyle w:val="Bibliography"/>
@@ -8396,7 +8776,7 @@
       <w:r>
         <w:t xml:space="preserve"> </w:t>
       </w:r>
-      <w:hyperlink r:id="rId118">
+      <w:hyperlink r:id="rId122">
         <w:r>
           <w:rPr>
             <w:rStyle w:val="Hyperlink"/>
@@ -8408,8 +8788,8 @@
         <w:t xml:space="preserve">.</w:t>
       </w:r>
     </w:p>
-    <w:bookmarkEnd w:id="119"/>
-    <w:bookmarkStart w:id="121" w:name="ref-zang2012"/>
+    <w:bookmarkEnd w:id="123"/>
+    <w:bookmarkStart w:id="125" w:name="ref-zang2012"/>
     <w:p>
       <w:pPr>
         <w:pStyle w:val="Bibliography"/>
@@ -8421,7 +8801,7 @@
         <w:t xml:space="preserve"> </w:t>
       </w:r>
       <w:r>
-        <w:t xml:space="preserve">“The Next Generation Proteasome Inhibitors Carfilzomib and Oprozomib Activate Prosurvival Autophagy via Induction of the Unfolded Protein Response and ATF4.”</w:t>
+        <w:t xml:space="preserve">“Carfilzomib and ONX 0912 Inhibit Cell Survival and Tumor Growth of Head and Neck Cancer and Their Activities Are Enhanced by Suppression of Mcl-1 or Autophagy.”</w:t>
       </w:r>
       <w:r>
         <w:t xml:space="preserve"> </w:t>
@@ -8431,32 +8811,32 @@
           <w:i/>
           <w:iCs/>
         </w:rPr>
-        <w:t xml:space="preserve">Autophagy</w:t>
-      </w:r>
-      <w:r>
-        <w:t xml:space="preserve"> </w:t>
-      </w:r>
-      <w:r>
-        <w:t xml:space="preserve">8 (12): 1873–74.</w:t>
-      </w:r>
-      <w:r>
-        <w:t xml:space="preserve"> </w:t>
-      </w:r>
-      <w:hyperlink r:id="rId120">
+        <w:t xml:space="preserve">Clinical Cancer Research</w:t>
+      </w:r>
+      <w:r>
+        <w:t xml:space="preserve"> </w:t>
+      </w:r>
+      <w:r>
+        <w:t xml:space="preserve">18 (20): 5639–49.</w:t>
+      </w:r>
+      <w:r>
+        <w:t xml:space="preserve"> </w:t>
+      </w:r>
+      <w:hyperlink r:id="rId124">
         <w:r>
           <w:rPr>
             <w:rStyle w:val="Hyperlink"/>
           </w:rPr>
-          <w:t xml:space="preserve">https://doi.org/10.4161/auto.22185</w:t>
+          <w:t xml:space="preserve">https://doi.org/10.1158/1078-0432.CCR-12-1213</w:t>
         </w:r>
       </w:hyperlink>
       <w:r>
         <w:t xml:space="preserve">.</w:t>
       </w:r>
     </w:p>
-    <w:bookmarkEnd w:id="121"/>
-    <w:bookmarkEnd w:id="122"/>
-    <w:bookmarkEnd w:id="123"/>
+    <w:bookmarkEnd w:id="125"/>
+    <w:bookmarkEnd w:id="126"/>
+    <w:bookmarkEnd w:id="127"/>
     <w:sectPr>
       <w:footnotePr>
         <w:numRestart w:val="eachSect"/>

</xml_diff>